<commit_message>
Label court companion forms and build conditional packet templates
</commit_message>
<xml_diff>
--- a/docassemble/ApplicationForNameChange/data/templates/Application_for_name_change_next_steps.docx
+++ b/docassemble/ApplicationForNameChange/data/templates/Application_for_name_change_next_steps.docx
@@ -3,82 +3,194 @@
 <w:document xmlns:wpc="http://schemas.microsoft.com/office/word/2010/wordprocessingCanvas" xmlns:mo="http://schemas.microsoft.com/office/mac/office/2008/main" xmlns:mc="http://schemas.openxmlformats.org/markup-compatibility/2006" xmlns:mv="urn:schemas-microsoft-com:mac:vml" xmlns:o="urn:schemas-microsoft-com:office:office" xmlns:r="http://schemas.openxmlformats.org/officeDocument/2006/relationships" xmlns:m="http://schemas.openxmlformats.org/officeDocument/2006/math" xmlns:v="urn:schemas-microsoft-com:vml" xmlns:wp14="http://schemas.microsoft.com/office/word/2010/wordprocessingDrawing" xmlns:wp="http://schemas.openxmlformats.org/drawingml/2006/wordprocessingDrawing" xmlns:w10="urn:schemas-microsoft-com:office:word" xmlns:w="http://schemas.openxmlformats.org/wordprocessingml/2006/main" xmlns:w14="http://schemas.microsoft.com/office/word/2010/wordml" xmlns:wpg="http://schemas.microsoft.com/office/word/2010/wordprocessingGroup" xmlns:wpi="http://schemas.microsoft.com/office/word/2010/wordprocessingInk" xmlns:wne="http://schemas.microsoft.com/office/word/2006/wordml" xmlns:wps="http://schemas.microsoft.com/office/word/2010/wordprocessingShape" mc:Ignorable="w14 wp14">
   <w:body>
     <w:p>
-      <w:pPr>
-        <w:pStyle w:val="Title"/>
-      </w:pPr>
       <w:r>
-        <w:t>Review your name change application</w:t>
-      </w:r>
-    </w:p>
-    <w:p>
-      <w:pPr>
-        <w:pStyle w:val="Heading1"/>
-      </w:pPr>
-      <w:r>
-        <w:t>Check the application</w:t>
+        <w:t>Minnesota name change — your next steps</w:t>
       </w:r>
     </w:p>
     <w:p>
       <w:r>
-        <w:t>Review all six pages and any extra sheets. Check every current and requested name, date of birth, and checked box. Attach extra sheets where the form requires them. Review and sign only statements that are true.</w:t>
-      </w:r>
-    </w:p>
-    <w:p>
-      <w:pPr>
-        <w:pStyle w:val="Heading1"/>
-      </w:pPr>
-      <w:r>
-        <w:t>Read the court instructions</w:t>
+        <w:t>For {{ users[0].name.full() }}</w:t>
       </w:r>
     </w:p>
     <w:p>
       <w:r>
-        <w:t>This interview prepares NAM102, not a complete filing packet. Read NAM101 and the instructions for your circumstances at https://mncourts.gov/help-topics/name-change. You may need additional forms, notices, supporting documents, and a hearing.</w:t>
-      </w:r>
-    </w:p>
-    <w:p>
-      <w:pPr>
-        <w:pStyle w:val="Heading1"/>
-      </w:pPr>
-      <w:r>
-        <w:t>Get help with the next steps</w:t>
+        <w:t>Nothing has been filed or approved. Review every page of the packet.</w:t>
       </w:r>
     </w:p>
     <w:p>
       <w:r>
-        <w:t>Ask the court self-help center about filing and hearing procedures. Requirements can differ for minors, felony convictions, and birth records. Do not assume downloading this application changes a name or files a case.</w:t>
-      </w:r>
-    </w:p>
-    <w:p>
-      <w:pPr>
-        <w:pStyle w:val="Heading1"/>
-      </w:pPr>
-      <w:r>
-        <w:t>Keep copies</w:t>
+        <w:t>1. Review and sign the application (NAM102). Any included spouse must sign. Each included child age 14 or older must sign. Use an additional signature sheet for more than one child needing to sign.</w:t>
       </w:r>
     </w:p>
     <w:p>
       <w:r>
-        <w:t>Keep a copy of what you file. After the court makes a decision, follow its instructions about certified copies and updating records.</w:t>
+        <w:t>2. Sign one criminal-history release (NAM103) for each covered person age 10 or older. The packet includes {{ release_people | length }} release(s). If the binary sex choices do not fit, ask court administration how to complete that field before filing.</w:t>
       </w:r>
     </w:p>
     <w:p>
-      <w:pPr>
-        <w:pStyle w:val="Heading1"/>
-      </w:pPr>
       <w:r>
-        <w:t>More information from LawHelpMN</w:t>
+        <w:t>3. Review the proposed order (NAM107). The portions below IT IS ORDERED and the judge’s signature are for the court. The hearing date and service/no-objection findings are left blank.</w:t>
       </w:r>
     </w:p>
     <w:p>
-      <w:hyperlink r:id="rId9">
-        <w:r>
-          <w:rPr>
-            <w:rStyle w:val="Hyperlink"/>
-          </w:rPr>
-          <w:t>Name Change - Minnesota Court Forms and Information</w:t>
-        </w:r>
-      </w:hyperlink>
+      <w:r>
+        <w:t>4. Read the included official instructions (NAM101). File in the county where you live. Pay the fee or submit the applicable fee-waiver or exemption documents. Ask court administration how to schedule your hearing.</w:t>
+      </w:r>
+    </w:p>
+    <w:p>
+      <w:r>
+        <w:t>5. Bring two witnesses who know you to the hearing unless the court confirms an exception. Included minors must attend. Obtain certified copies of a signed order after approval.</w:t>
+      </w:r>
+    </w:p>
+    <w:p>
+      <w:r>
+        <w:t>{%p if users1_divorced_seeking_change_to_legal_name_on_birth_certificate %}</w:t>
+      </w:r>
+    </w:p>
+    <w:p>
+      <w:r>
+        <w:t>Divorce exception: File certified copies of your birth certificate and dissolution document. Confirm the exception with court administration. This packet omits the criminal-history release for the verified single-adult exception.</w:t>
+      </w:r>
+    </w:p>
+    <w:p>
+      <w:r>
+        <w:t>{%p endif %}</w:t>
+      </w:r>
+    </w:p>
+    <w:p>
+      <w:r>
+        <w:t>{%p if has_felony %}</w:t>
+      </w:r>
+    </w:p>
+    <w:p>
+      <w:r>
+        <w:t>Felony conviction: Serve the prosecuting authority that obtained each conviction with NAM104 and a copy of the application. Federal or out-of-state convictions also require notice to the Minnesota Attorney General. File proof of service. The authority has 30 days after service to object. This packet does not certify that notice has occurred. Contact a lawyer if an objection is filed.</w:t>
+      </w:r>
+    </w:p>
+    <w:p>
+      <w:r>
+        <w:t>Court administrator mailing address: {{ court_administrator_address }}, {{ court_administrator_city_state_zip }}</w:t>
+      </w:r>
+    </w:p>
+    <w:p>
+      <w:r>
+        <w:t>{%p endif %}</w:t>
+      </w:r>
+    </w:p>
+    <w:p>
+      <w:r>
+        <w:t>{%p if users1_inmate_in_correctional_facility_and_submitting_inmate_aff %}</w:t>
+      </w:r>
+    </w:p>
+    <w:p>
+      <w:r>
+        <w:t>Incarceration: Review and sign NAM105 only if every statement is true. A repeated name change request during confinement needs legal review.</w:t>
+      </w:r>
+    </w:p>
+    <w:p>
+      <w:r>
+        <w:t>{%p endif %}</w:t>
+      </w:r>
+    </w:p>
+    <w:p>
+      <w:r>
+        <w:t>{%p if parental_notice_needed %}</w:t>
+      </w:r>
+    </w:p>
+    <w:p>
+      <w:r>
+        <w:t>Children’s other parent: Fill in the hearing notice after the court schedules the hearing. Attach the application. Ask court administration whether certified mail or personal service is required. For personal service, use a person age 18 or older who can complete NAM205 with the actual date, place, and delivery facts. Do not sign the service affidavit yourself unless you actually performed valid service.</w:t>
+      </w:r>
+    </w:p>
+    <w:p>
+      <w:r>
+        <w:t>{%p if not parent_address_known %}</w:t>
+      </w:r>
+    </w:p>
+    <w:p>
+      <w:r>
+        <w:t>Unknown address: Review the search-effort statements in NAM207. Its first statement says the application has been filed: file the application before signing that statement. Ask the judge to permit publication or other notice; wait for an order before arranging publication. The newspaper supplies proof of publication. The publication order fields are left blank for the judge.</w:t>
+      </w:r>
+    </w:p>
+    <w:p>
+      <w:r>
+        <w:t>{%p endif %}</w:t>
+      </w:r>
+    </w:p>
+    <w:p>
+      <w:r>
+        <w:t>{%p endif %}</w:t>
+      </w:r>
+    </w:p>
+    <w:p>
+      <w:r>
+        <w:t>{%p if included_children and parents_nonapplicant_unknown %}</w:t>
+      </w:r>
+    </w:p>
+    <w:p>
+      <w:r>
+        <w:t>Unknown parent: Bring the certified birth certificate showing that no second parent is named. Ask court administration whether an adjudicated parent or other circumstances require notice.</w:t>
+      </w:r>
+    </w:p>
+    <w:p>
+      <w:r>
+        <w:t>{%p endif %}</w:t>
+      </w:r>
+    </w:p>
+    <w:p>
+      <w:r>
+        <w:t>{%p if request_fee_waiver %}</w:t>
+      </w:r>
+    </w:p>
+    <w:p>
+      <w:r>
+        <w:t>{%p if users1_inmate_in_correctional_facility_and_submitting_inmate_aff %}</w:t>
+      </w:r>
+    </w:p>
+    <w:p>
+      <w:r>
+        <w:t>Inmate fee waiver: Complete FEE201 separately with the correctional account records it requires. A standard FEE102 affidavit is not generated for this route.</w:t>
+      </w:r>
+    </w:p>
+    <w:p>
+      <w:r>
+        <w:t>{%p else %}</w:t>
+      </w:r>
+    </w:p>
+    <w:p>
+      <w:r>
+        <w:t>Fee waiver: Review and sign the confidential FEE102 adaptation. Attach proof of public assistance or household income as applicable. Confirm that expenses and assets are complete. The court decides whether fees will be waived. Submit it as a confidential document, separately from publicly accessible forms.</w:t>
+      </w:r>
+    </w:p>
+    <w:p>
+      <w:r>
+        <w:t>{%p endif %}</w:t>
+      </w:r>
+    </w:p>
+    <w:p>
+      <w:r>
+        <w:t>{%p endif %}</w:t>
+      </w:r>
+    </w:p>
+    <w:p>
+      <w:r>
+        <w:t>After approval, follow NAM106 and the signed order to update records. If you have criminal history, report the approved name change to the BCA within the required 10-day period. File a certified order with each county recorder where there is an interest in land.</w:t>
+      </w:r>
+    </w:p>
+    <w:p>
+      <w:r>
+        <w:t>Court forms and instructions: https://mncourts.gov/getforms/name-change</w:t>
+      </w:r>
+    </w:p>
+    <w:p>
+      <w:r>
+        <w:t>Court fee-waiver forms: https://mncourts.gov/getforms/fee-waiver</w:t>
+      </w:r>
+    </w:p>
+    <w:p>
+      <w:r>
+        <w:t>Name Change — Minnesota Court Forms and Information on LawHelpMN:</w:t>
+      </w:r>
     </w:p>
     <w:p>
       <w:r>
@@ -458,6 +570,10 @@
     <w:name w:val="Normal"/>
     <w:qFormat/>
     <w:rsid w:val="00FC693F"/>
+    <w:rPr>
+      <w:rFonts w:ascii="Arial" w:hAnsi="Arial"/>
+      <w:sz w:val="22"/>
+    </w:rPr>
   </w:style>
   <w:style w:type="paragraph" w:styleId="Header">
     <w:name w:val="header"/>

</xml_diff>

<commit_message>
Repair court form rendering and add Hennepin packet resources
</commit_message>
<xml_diff>
--- a/docassemble/ApplicationForNameChange/data/templates/Application_for_name_change_next_steps.docx
+++ b/docassemble/ApplicationForNameChange/data/templates/Application_for_name_change_next_steps.docx
@@ -3,6 +3,9 @@
 <w:document xmlns:wpc="http://schemas.microsoft.com/office/word/2010/wordprocessingCanvas" xmlns:mo="http://schemas.microsoft.com/office/mac/office/2008/main" xmlns:mc="http://schemas.openxmlformats.org/markup-compatibility/2006" xmlns:mv="urn:schemas-microsoft-com:mac:vml" xmlns:o="urn:schemas-microsoft-com:office:office" xmlns:r="http://schemas.openxmlformats.org/officeDocument/2006/relationships" xmlns:m="http://schemas.openxmlformats.org/officeDocument/2006/math" xmlns:v="urn:schemas-microsoft-com:vml" xmlns:wp14="http://schemas.microsoft.com/office/word/2010/wordprocessingDrawing" xmlns:wp="http://schemas.openxmlformats.org/drawingml/2006/wordprocessingDrawing" xmlns:w10="urn:schemas-microsoft-com:office:word" xmlns:w="http://schemas.openxmlformats.org/wordprocessingml/2006/main" xmlns:w14="http://schemas.microsoft.com/office/word/2010/wordml" xmlns:wpg="http://schemas.microsoft.com/office/word/2010/wordprocessingGroup" xmlns:wpi="http://schemas.microsoft.com/office/word/2010/wordprocessingInk" xmlns:wne="http://schemas.microsoft.com/office/word/2006/wordml" xmlns:wps="http://schemas.microsoft.com/office/word/2010/wordprocessingShape" mc:Ignorable="w14 wp14">
   <w:body>
     <w:p>
+      <w:pPr>
+        <w:pStyle w:val="Title"/>
+      </w:pPr>
       <w:r>
         <w:t>Minnesota name change — your next steps</w:t>
       </w:r>
@@ -29,7 +32,22 @@
     </w:p>
     <w:p>
       <w:r>
-        <w:t>3. Review the proposed order (NAM107). The portions below IT IS ORDERED and the judge’s signature are for the court. The hearing date and service/no-objection findings are left blank.</w:t>
+        <w:t>3. Review the proposed order(s) (NAM107). The portions below IT IS ORDERED and the judge’s signature are for the court. The hearing date and service/no-objection findings are left blank.</w:t>
+      </w:r>
+    </w:p>
+    <w:p>
+      <w:r>
+        <w:t>{%p if hennepin_packet %}</w:t>
+      </w:r>
+    </w:p>
+    <w:p>
+      <w:r>
+        <w:t>Hennepin: This packet includes a separate proposed order for each person requesting a change. Read the included supplemental guide. For notice to a known-address parent, follow its certified-mail, affidavit-of-service, and receipt requirements. NAM205 is for actual personal service; it does not prove mailing. Ask the court for the correct mailing affidavit.</w:t>
+      </w:r>
+    </w:p>
+    <w:p>
+      <w:r>
+        <w:t>{%p endif %}</w:t>
       </w:r>
     </w:p>
     <w:p>
@@ -99,7 +117,7 @@
     </w:p>
     <w:p>
       <w:r>
-        <w:t>Children’s other parent: Fill in the hearing notice after the court schedules the hearing. Attach the application. Ask court administration whether certified mail or personal service is required. For personal service, use a person age 18 or older who can complete NAM205 with the actual date, place, and delivery facts. Do not sign the service affidavit yourself unless you actually performed valid service.</w:t>
+        <w:t>Children’s other parent: Fill in the hearing notice after the court schedules the hearing. Attach the application. Ask court administration whether certified mail or personal service is required. For personal service, use a person age 18 or older who can complete NAM205 with the actual date, place, and delivery facts. Follow the included personal-service instructions about who may serve. The person who actually served the papers completes the affidavit.</w:t>
       </w:r>
     </w:p>
     <w:p>
@@ -129,7 +147,7 @@
     </w:p>
     <w:p>
       <w:r>
-        <w:t>Unknown parent: Bring the certified birth certificate showing that no second parent is named. Ask court administration whether an adjudicated parent or other circumstances require notice.</w:t>
+        <w:t>Unknown parent: Bring the certified birth certificate showing that no second parent is named. Your answers confirmed no marriage or attempted marriage in the stated period, Recognition of Parentage, or parentage order. Ask court administration to confirm that notice may be omitted.</w:t>
       </w:r>
     </w:p>
     <w:p>
@@ -149,7 +167,7 @@
     </w:p>
     <w:p>
       <w:r>
-        <w:t>Inmate fee waiver: Complete FEE201 separately with the correctional account records it requires. A standard FEE102 affidavit is not generated for this route.</w:t>
+        <w:t>Inmate fee waiver: Complete the included blank FEE201 separately if its eligibility statements apply. Include the correctional account records and authorization it requires. A standard FEE102 affidavit is not generated for this route.</w:t>
       </w:r>
     </w:p>
     <w:p>

</xml_diff>

<commit_message>
Clarify packet limits and improve companion form headings and layout
</commit_message>
<xml_diff>
--- a/docassemble/ApplicationForNameChange/data/templates/Application_for_name_change_next_steps.docx
+++ b/docassemble/ApplicationForNameChange/data/templates/Application_for_name_change_next_steps.docx
@@ -4,7 +4,7 @@
   <w:body>
     <w:p>
       <w:pPr>
-        <w:pStyle w:val="Title"/>
+        <w:pStyle w:val="Heading1"/>
       </w:pPr>
       <w:r>
         <w:t>Minnesota name change — your next steps</w:t>
@@ -211,9 +211,14 @@
       </w:r>
     </w:p>
     <w:p>
-      <w:r>
-        <w:t>https://www.lawhelpmn.org/self-help-library/legal-resource/name-change-minnesota-court-forms-and-information</w:t>
-      </w:r>
+      <w:hyperlink r:id="rId9">
+        <w:r>
+          <w:rPr>
+            <w:rStyle w:val="Hyperlink"/>
+          </w:rPr>
+          <w:t>https://www.lawhelpmn.org/self-help-library/legal-resource/name-change-minnesota-court-forms-and-information</w:t>
+        </w:r>
+      </w:hyperlink>
     </w:p>
     <w:sectPr>
       <w:pgSz w:w="12240" w:h="15840"/>
@@ -588,6 +593,9 @@
     <w:name w:val="Normal"/>
     <w:qFormat/>
     <w:rsid w:val="00FC693F"/>
+    <w:pPr>
+      <w:spacing w:after="120"/>
+    </w:pPr>
     <w:rPr>
       <w:rFonts w:ascii="Arial" w:hAnsi="Arial"/>
       <w:sz w:val="22"/>
@@ -652,11 +660,11 @@
       <w:outlineLvl w:val="0"/>
     </w:pPr>
     <w:rPr>
-      <w:rFonts w:asciiTheme="majorHAnsi" w:eastAsiaTheme="majorEastAsia" w:hAnsiTheme="majorHAnsi" w:cstheme="majorBidi"/>
+      <w:rFonts w:asciiTheme="majorHAnsi" w:eastAsiaTheme="majorEastAsia" w:hAnsiTheme="majorHAnsi" w:cstheme="majorBidi" w:ascii="Arial" w:hAnsi="Arial"/>
       <w:b/>
       <w:bCs/>
-      <w:color w:val="365F91" w:themeColor="accent1" w:themeShade="BF"/>
-      <w:sz w:val="28"/>
+      <w:color w:val="000000"/>
+      <w:sz w:val="32"/>
       <w:szCs w:val="28"/>
     </w:rPr>
   </w:style>

</xml_diff>

<commit_message>
Apply plain-language and question-style review
Review screens against plain-language guidance and the Assembly Line
"Writing good questions" guide: one question per screen, short field
labels, optional fields marked, review screens that show answers in
interview order, and referral screens that let users edit the answer
that triggered them. See DECISIONS.md for details.

Co-Authored-By: Claude Opus 5.5 <noreply@anthropic.com>
</commit_message>
<xml_diff>
--- a/docassemble/ApplicationForNameChange/data/templates/Application_for_name_change_next_steps.docx
+++ b/docassemble/ApplicationForNameChange/data/templates/Application_for_name_change_next_steps.docx
@@ -22,12 +22,12 @@
     </w:p>
     <w:p>
       <w:r>
-        <w:t>1. Review and sign the application (NAM102). Any included spouse must sign. Each included child age 14 or older must sign. Use an additional signature sheet for more than one child needing to sign.</w:t>
+        <w:t>1. Review and sign the application (NAM102). Any included spouse must sign. Each included child age 14 or older must sign. If more than one child needs to sign, add an extra signature page.</w:t>
       </w:r>
     </w:p>
     <w:p>
       <w:r>
-        <w:t>2. Sign one criminal-history release (NAM103) for each covered person age 10 or older. The packet includes {{ release_people | length }} release(s). If the binary sex choices do not fit, ask court administration how to complete that field before filing.</w:t>
+        <w:t>2. Sign one criminal-history release (NAM103) for each covered person age 10 or older. The packet includes {{ release_people | length }} release(s). If neither sex choice on the release fits, ask court administration how to fill it in before you file.</w:t>
       </w:r>
     </w:p>
     <w:p>
@@ -57,7 +57,7 @@
     </w:p>
     <w:p>
       <w:r>
-        <w:t>5. Bring two witnesses who know you to the hearing unless the court confirms an exception. Included minors must attend. Obtain certified copies of a signed order after approval.</w:t>
+        <w:t>5. Bring 2 witnesses who know you to the hearing. If you cannot, ask the court if you can skip this. Included minors must attend. After the judge signs the order, get certified copies of it.</w:t>
       </w:r>
     </w:p>
     <w:p>
@@ -177,7 +177,7 @@
     </w:p>
     <w:p>
       <w:r>
-        <w:t>Fee waiver: Review and sign the confidential FEE102 adaptation. Attach proof of public assistance or household income as applicable. Confirm that expenses and assets are complete. The court decides whether fees will be waived. Submit it as a confidential document, separately from publicly accessible forms.</w:t>
+        <w:t>Fee waiver: Review and sign the confidential FEE102 adaptation. Attach proof of public assistance or household income. Confirm that expenses and assets are complete. The court decides whether fees will be waived. Submit it as a confidential document, separately from publicly accessible forms.</w:t>
       </w:r>
     </w:p>
     <w:p>

</xml_diff>